<commit_message>
fix: fix devis template — FOR/END-FOR in separate rows for proper table row repetition
Co-Authored-By: Claude Opus 4.6 (1M context) <noreply@anthropic.com>
</commit_message>
<xml_diff>
--- a/example-vault/templates/devis-produits.docx
+++ b/example-vault/templates/devis-produits.docx
@@ -93,7 +93,6 @@
     <w:p>
       <w:pPr>
         <w:pStyle w:val="Heading1"/>
-        <w:spacing w:before="300"/>
       </w:pPr>
       <w:r>
         <w:rPr>
@@ -121,7 +120,7 @@
     <w:p>
       <w:pPr>
         <w:pStyle w:val="Heading1"/>
-        <w:spacing w:after="200" w:before="300"/>
+        <w:spacing w:after="200"/>
       </w:pPr>
       <w:r>
         <w:rPr>
@@ -156,6 +155,7 @@
       <w:tr>
         <w:tc>
           <w:tcPr>
+            <w:tcW w:type="dxa" w:w="2000"/>
             <w:tcBorders>
               <w:top w:val="single" w:color="CCCCCC" w:sz="1"/>
               <w:left w:val="single" w:color="CCCCCC" w:sz="1"/>
@@ -179,6 +179,7 @@
         </w:tc>
         <w:tc>
           <w:tcPr>
+            <w:tcW w:type="dxa" w:w="3500"/>
             <w:tcBorders>
               <w:top w:val="single" w:color="CCCCCC" w:sz="1"/>
               <w:left w:val="single" w:color="CCCCCC" w:sz="1"/>
@@ -202,6 +203,7 @@
         </w:tc>
         <w:tc>
           <w:tcPr>
+            <w:tcW w:type="dxa" w:w="800"/>
             <w:tcBorders>
               <w:top w:val="single" w:color="CCCCCC" w:sz="1"/>
               <w:left w:val="single" w:color="CCCCCC" w:sz="1"/>
@@ -228,6 +230,7 @@
         </w:tc>
         <w:tc>
           <w:tcPr>
+            <w:tcW w:type="dxa" w:w="1500"/>
             <w:tcBorders>
               <w:top w:val="single" w:color="CCCCCC" w:sz="1"/>
               <w:left w:val="single" w:color="CCCCCC" w:sz="1"/>
@@ -254,6 +257,7 @@
         </w:tc>
         <w:tc>
           <w:tcPr>
+            <w:tcW w:type="dxa" w:w="1700"/>
             <w:tcBorders>
               <w:top w:val="single" w:color="CCCCCC" w:sz="1"/>
               <w:left w:val="single" w:color="CCCCCC" w:sz="1"/>
@@ -282,23 +286,36 @@
       <w:tr>
         <w:tc>
           <w:tcPr>
-            <w:tcBorders>
-              <w:top w:val="single" w:color="CCCCCC" w:sz="1"/>
-              <w:left w:val="single" w:color="CCCCCC" w:sz="1"/>
-              <w:bottom w:val="single" w:color="CCCCCC" w:sz="1"/>
-              <w:right w:val="single" w:color="CCCCCC" w:sz="1"/>
+            <w:gridSpan w:val="5"/>
+            <w:tcBorders>
+              <w:top w:val="none"/>
+              <w:left w:val="none"/>
+              <w:bottom w:val="none"/>
+              <w:right w:val="none"/>
             </w:tcBorders>
           </w:tcPr>
           <w:p>
             <w:r>
               <w:rPr>
                 <w:color w:val="FFFFFF"/>
-                <w:sz w:val="1"/>
-                <w:szCs w:val="1"/>
+                <w:sz w:val="2"/>
+                <w:szCs w:val="2"/>
               </w:rPr>
               <w:t xml:space="preserve">+++FOR ligne IN fragments.produits+++</w:t>
             </w:r>
           </w:p>
+        </w:tc>
+      </w:tr>
+      <w:tr>
+        <w:tc>
+          <w:tcPr>
+            <w:tcBorders>
+              <w:top w:val="single" w:color="CCCCCC" w:sz="1"/>
+              <w:left w:val="single" w:color="CCCCCC" w:sz="1"/>
+              <w:bottom w:val="single" w:color="CCCCCC" w:sz="1"/>
+              <w:right w:val="single" w:color="CCCCCC" w:sz="1"/>
+            </w:tcBorders>
+          </w:tcPr>
           <w:p>
             <w:r>
               <w:rPr>
@@ -307,26 +324,26 @@
                 <w:sz w:val="20"/>
                 <w:szCs w:val="20"/>
               </w:rPr>
-              <w:t xml:space="preserve">+++INS ligne.produit+++</w:t>
-            </w:r>
-          </w:p>
-        </w:tc>
-        <w:tc>
-          <w:tcPr>
-            <w:tcBorders>
-              <w:top w:val="single" w:color="CCCCCC" w:sz="1"/>
-              <w:left w:val="single" w:color="CCCCCC" w:sz="1"/>
-              <w:bottom w:val="single" w:color="CCCCCC" w:sz="1"/>
-              <w:right w:val="single" w:color="CCCCCC" w:sz="1"/>
-            </w:tcBorders>
-          </w:tcPr>
-          <w:p>
-            <w:r>
-              <w:rPr>
-                <w:sz w:val="20"/>
-                <w:szCs w:val="20"/>
-              </w:rPr>
-              <w:t xml:space="preserve">+++INS ligne.body+++</w:t>
+              <w:t xml:space="preserve">+++INS $ligne.produit+++</w:t>
+            </w:r>
+          </w:p>
+        </w:tc>
+        <w:tc>
+          <w:tcPr>
+            <w:tcBorders>
+              <w:top w:val="single" w:color="CCCCCC" w:sz="1"/>
+              <w:left w:val="single" w:color="CCCCCC" w:sz="1"/>
+              <w:bottom w:val="single" w:color="CCCCCC" w:sz="1"/>
+              <w:right w:val="single" w:color="CCCCCC" w:sz="1"/>
+            </w:tcBorders>
+          </w:tcPr>
+          <w:p>
+            <w:r>
+              <w:rPr>
+                <w:sz w:val="20"/>
+                <w:szCs w:val="20"/>
+              </w:rPr>
+              <w:t xml:space="preserve">+++INS $ligne.body+++</w:t>
             </w:r>
           </w:p>
         </w:tc>
@@ -348,7 +365,7 @@
                 <w:sz w:val="20"/>
                 <w:szCs w:val="20"/>
               </w:rPr>
-              <w:t xml:space="preserve">+++INS ligne.qte+++</w:t>
+              <w:t xml:space="preserve">+++INS $ligne.qte+++</w:t>
             </w:r>
           </w:p>
         </w:tc>
@@ -370,34 +387,50 @@
                 <w:sz w:val="20"/>
                 <w:szCs w:val="20"/>
               </w:rPr>
-              <w:t xml:space="preserve">+++INS ligne.pu+++ €</w:t>
-            </w:r>
-          </w:p>
-        </w:tc>
-        <w:tc>
-          <w:tcPr>
-            <w:tcBorders>
-              <w:top w:val="single" w:color="CCCCCC" w:sz="1"/>
-              <w:left w:val="single" w:color="CCCCCC" w:sz="1"/>
-              <w:bottom w:val="single" w:color="CCCCCC" w:sz="1"/>
-              <w:right w:val="single" w:color="CCCCCC" w:sz="1"/>
-            </w:tcBorders>
-          </w:tcPr>
-          <w:p>
-            <w:r>
-              <w:rPr>
-                <w:sz w:val="20"/>
-                <w:szCs w:val="20"/>
-              </w:rPr>
-              <w:t xml:space="preserve">+++INS ligne.total+++ €</w:t>
-            </w:r>
-          </w:p>
+              <w:t xml:space="preserve">+++INS $ligne.pu+++ €</w:t>
+            </w:r>
+          </w:p>
+        </w:tc>
+        <w:tc>
+          <w:tcPr>
+            <w:tcBorders>
+              <w:top w:val="single" w:color="CCCCCC" w:sz="1"/>
+              <w:left w:val="single" w:color="CCCCCC" w:sz="1"/>
+              <w:bottom w:val="single" w:color="CCCCCC" w:sz="1"/>
+              <w:right w:val="single" w:color="CCCCCC" w:sz="1"/>
+            </w:tcBorders>
+          </w:tcPr>
+          <w:p>
+            <w:pPr>
+              <w:jc w:val="right"/>
+            </w:pPr>
+            <w:r>
+              <w:rPr>
+                <w:sz w:val="20"/>
+                <w:szCs w:val="20"/>
+              </w:rPr>
+              <w:t xml:space="preserve">+++INS $ligne.total+++ €</w:t>
+            </w:r>
+          </w:p>
+        </w:tc>
+      </w:tr>
+      <w:tr>
+        <w:tc>
+          <w:tcPr>
+            <w:gridSpan w:val="5"/>
+            <w:tcBorders>
+              <w:top w:val="none"/>
+              <w:left w:val="none"/>
+              <w:bottom w:val="none"/>
+              <w:right w:val="none"/>
+            </w:tcBorders>
+          </w:tcPr>
           <w:p>
             <w:r>
               <w:rPr>
                 <w:color w:val="FFFFFF"/>
-                <w:sz w:val="1"/>
-                <w:szCs w:val="1"/>
+                <w:sz w:val="2"/>
+                <w:szCs w:val="2"/>
               </w:rPr>
               <w:t xml:space="preserve">+++END-FOR ligne+++</w:t>
             </w:r>
@@ -651,7 +684,7 @@
           <w:sz w:val="20"/>
           <w:szCs w:val="20"/>
         </w:rPr>
-        <w:t xml:space="preserve">• Hébergement SecNumCloud qualifiée</w:t>
+        <w:t xml:space="preserve">• Hébergement sur infrastructure SecNumCloud qualifiée</w:t>
       </w:r>
     </w:p>
     <w:sectPr>

</xml_diff>